<commit_message>
Created Documents to help with the team assignments
</commit_message>
<xml_diff>
--- a/01_Standards/GitHub_Repository_Folder_Structure.docx
+++ b/01_Standards/GitHub_Repository_Folder_Structure.docx
@@ -5695,7 +5695,19 @@
         <w:rPr>
           <w:rFonts w:ascii="Courier New" w:hAnsi="Courier New" w:cs="Courier New"/>
         </w:rPr>
-        <w:t xml:space="preserve"> Team_02_Student_Profile_Resume/</w:t>
+        <w:t xml:space="preserve"> Team</w:t>
+      </w:r>
+      <w:r>
+        <w:rPr>
+          <w:rFonts w:ascii="Courier New" w:hAnsi="Courier New" w:cs="Courier New"/>
+        </w:rPr>
+        <w:t>2</w:t>
+      </w:r>
+      <w:r>
+        <w:rPr>
+          <w:rFonts w:ascii="Courier New" w:hAnsi="Courier New" w:cs="Courier New"/>
+        </w:rPr>
+        <w:t>/</w:t>
       </w:r>
     </w:p>
     <w:p>
@@ -6479,7 +6491,13 @@
         <w:rPr>
           <w:rFonts w:ascii="Courier New" w:hAnsi="Courier New" w:cs="Courier New"/>
         </w:rPr>
-        <w:t xml:space="preserve"> Team_03_Company_Profile_Job_Posting/</w:t>
+        <w:t xml:space="preserve"> Team</w:t>
+      </w:r>
+      <w:r>
+        <w:rPr>
+          <w:rFonts w:ascii="Courier New" w:hAnsi="Courier New" w:cs="Courier New"/>
+        </w:rPr>
+        <w:t>3/</w:t>
       </w:r>
     </w:p>
     <w:p>
@@ -7264,7 +7282,13 @@
         <w:rPr>
           <w:rFonts w:ascii="Courier New" w:hAnsi="Courier New" w:cs="Courier New"/>
         </w:rPr>
-        <w:t xml:space="preserve"> Team_04_Search_Candidate_Matching/</w:t>
+        <w:t xml:space="preserve"> Team</w:t>
+      </w:r>
+      <w:r>
+        <w:rPr>
+          <w:rFonts w:ascii="Courier New" w:hAnsi="Courier New" w:cs="Courier New"/>
+        </w:rPr>
+        <w:t>4/</w:t>
       </w:r>
     </w:p>
     <w:p>
@@ -8048,7 +8072,13 @@
         <w:rPr>
           <w:rFonts w:ascii="Courier New" w:hAnsi="Courier New" w:cs="Courier New"/>
         </w:rPr>
-        <w:t xml:space="preserve"> Team_05_Notification_Messaging/</w:t>
+        <w:t xml:space="preserve"> Team</w:t>
+      </w:r>
+      <w:r>
+        <w:rPr>
+          <w:rFonts w:ascii="Courier New" w:hAnsi="Courier New" w:cs="Courier New"/>
+        </w:rPr>
+        <w:t>5/</w:t>
       </w:r>
     </w:p>
     <w:p>
@@ -8832,7 +8862,13 @@
         <w:rPr>
           <w:rFonts w:ascii="Courier New" w:hAnsi="Courier New" w:cs="Courier New"/>
         </w:rPr>
-        <w:t xml:space="preserve"> Team_06_News_Feed_Follow/</w:t>
+        <w:t xml:space="preserve"> Team</w:t>
+      </w:r>
+      <w:r>
+        <w:rPr>
+          <w:rFonts w:ascii="Courier New" w:hAnsi="Courier New" w:cs="Courier New"/>
+        </w:rPr>
+        <w:t>6/</w:t>
       </w:r>
     </w:p>
     <w:p>
@@ -9616,7 +9652,13 @@
         <w:rPr>
           <w:rFonts w:ascii="Courier New" w:hAnsi="Courier New" w:cs="Courier New"/>
         </w:rPr>
-        <w:t xml:space="preserve"> Team_07_Platform_External_Interfaces/</w:t>
+        <w:t xml:space="preserve"> Team</w:t>
+      </w:r>
+      <w:r>
+        <w:rPr>
+          <w:rFonts w:ascii="Courier New" w:hAnsi="Courier New" w:cs="Courier New"/>
+        </w:rPr>
+        <w:t>7/</w:t>
       </w:r>
     </w:p>
     <w:p>

</xml_diff>